<commit_message>
Atualização da minuta de protocolo
</commit_message>
<xml_diff>
--- a/protocolos_minutas/AMA_Protocolo_ServicoAssinaturaFaturasEletronicas.docx
+++ b/protocolos_minutas/AMA_Protocolo_ServicoAssinaturaFaturasEletronicas.docx
@@ -1,6 +1,6 @@
 
 <file path=word/document.xml><?xml version="1.0" encoding="utf-8"?>
-<w:document xmlns:wpc="http://schemas.microsoft.com/office/word/2010/wordprocessingCanvas" xmlns:cx="http://schemas.microsoft.com/office/drawing/2014/chartex" xmlns:cx1="http://schemas.microsoft.com/office/drawing/2015/9/8/chartex" xmlns:cx2="http://schemas.microsoft.com/office/drawing/2015/10/21/chartex" xmlns:cx3="http://schemas.microsoft.com/office/drawing/2016/5/9/chartex" xmlns:cx4="http://schemas.microsoft.com/office/drawing/2016/5/10/chartex" xmlns:cx5="http://schemas.microsoft.com/office/drawing/2016/5/11/chartex" xmlns:cx6="http://schemas.microsoft.com/office/drawing/2016/5/12/chartex" xmlns:cx7="http://schemas.microsoft.com/office/drawing/2016/5/13/chartex" xmlns:cx8="http://schemas.microsoft.com/office/drawing/2016/5/14/chartex" xmlns:mc="http://schemas.openxmlformats.org/markup-compatibility/2006" xmlns:aink="http://schemas.microsoft.com/office/drawing/2016/ink" xmlns:am3d="http://schemas.microsoft.com/office/drawing/2017/model3d" xmlns:o="urn:schemas-microsoft-com:office:office" xmlns:oel="http://schemas.microsoft.com/office/2019/extlst" xmlns:r="http://schemas.openxmlformats.org/officeDocument/2006/relationships" xmlns:m="http://schemas.openxmlformats.org/officeDocument/2006/math" xmlns:v="urn:schemas-microsoft-com:vml" xmlns:wp14="http://schemas.microsoft.com/office/word/2010/wordprocessingDrawing" xmlns:wp="http://schemas.openxmlformats.org/drawingml/2006/wordprocessingDrawing" xmlns:w10="urn:schemas-microsoft-com:office:word" xmlns:w="http://schemas.openxmlformats.org/wordprocessingml/2006/main" xmlns:w14="http://schemas.microsoft.com/office/word/2010/wordml" xmlns:w15="http://schemas.microsoft.com/office/word/2012/wordml" xmlns:w16cex="http://schemas.microsoft.com/office/word/2018/wordml/cex" xmlns:w16cid="http://schemas.microsoft.com/office/word/2016/wordml/cid" xmlns:w16="http://schemas.microsoft.com/office/word/2018/wordml" xmlns:w16du="http://schemas.microsoft.com/office/word/2023/wordml/word16du" xmlns:w16sdtdh="http://schemas.microsoft.com/office/word/2020/wordml/sdtdatahash" xmlns:w16se="http://schemas.microsoft.com/office/word/2015/wordml/symex" xmlns:wpg="http://schemas.microsoft.com/office/word/2010/wordprocessingGroup" xmlns:wpi="http://schemas.microsoft.com/office/word/2010/wordprocessingInk" xmlns:wne="http://schemas.microsoft.com/office/word/2006/wordml" xmlns:wps="http://schemas.microsoft.com/office/word/2010/wordprocessingShape" mc:Ignorable="w14 w15 w16se w16cid w16 w16cex w16sdtdh w16du wp14">
+<w:document xmlns:wpc="http://schemas.microsoft.com/office/word/2010/wordprocessingCanvas" xmlns:cx="http://schemas.microsoft.com/office/drawing/2014/chartex" xmlns:cx1="http://schemas.microsoft.com/office/drawing/2015/9/8/chartex" xmlns:cx2="http://schemas.microsoft.com/office/drawing/2015/10/21/chartex" xmlns:cx3="http://schemas.microsoft.com/office/drawing/2016/5/9/chartex" xmlns:cx4="http://schemas.microsoft.com/office/drawing/2016/5/10/chartex" xmlns:cx5="http://schemas.microsoft.com/office/drawing/2016/5/11/chartex" xmlns:cx6="http://schemas.microsoft.com/office/drawing/2016/5/12/chartex" xmlns:cx7="http://schemas.microsoft.com/office/drawing/2016/5/13/chartex" xmlns:cx8="http://schemas.microsoft.com/office/drawing/2016/5/14/chartex" xmlns:mc="http://schemas.openxmlformats.org/markup-compatibility/2006" xmlns:aink="http://schemas.microsoft.com/office/drawing/2016/ink" xmlns:am3d="http://schemas.microsoft.com/office/drawing/2017/model3d" xmlns:o="urn:schemas-microsoft-com:office:office" xmlns:oel="http://schemas.microsoft.com/office/2019/extlst" xmlns:r="http://schemas.openxmlformats.org/officeDocument/2006/relationships" xmlns:m="http://schemas.openxmlformats.org/officeDocument/2006/math" xmlns:v="urn:schemas-microsoft-com:vml" xmlns:wp14="http://schemas.microsoft.com/office/word/2010/wordprocessingDrawing" xmlns:wp="http://schemas.openxmlformats.org/drawingml/2006/wordprocessingDrawing" xmlns:w10="urn:schemas-microsoft-com:office:word" xmlns:w="http://schemas.openxmlformats.org/wordprocessingml/2006/main" xmlns:w14="http://schemas.microsoft.com/office/word/2010/wordml" xmlns:w15="http://schemas.microsoft.com/office/word/2012/wordml" xmlns:w16cex="http://schemas.microsoft.com/office/word/2018/wordml/cex" xmlns:w16cid="http://schemas.microsoft.com/office/word/2016/wordml/cid" xmlns:w16="http://schemas.microsoft.com/office/word/2018/wordml" xmlns:w16du="http://schemas.microsoft.com/office/word/2023/wordml/word16du" xmlns:w16sdtdh="http://schemas.microsoft.com/office/word/2020/wordml/sdtdatahash" xmlns:w16sdtfl="http://schemas.microsoft.com/office/word/2024/wordml/sdtformatlock" xmlns:w16se="http://schemas.microsoft.com/office/word/2015/wordml/symex" xmlns:wpg="http://schemas.microsoft.com/office/word/2010/wordprocessingGroup" xmlns:wpi="http://schemas.microsoft.com/office/word/2010/wordprocessingInk" xmlns:wne="http://schemas.microsoft.com/office/word/2006/wordml" xmlns:wps="http://schemas.microsoft.com/office/word/2010/wordprocessingShape" mc:Ignorable="w14 w15 w16se w16cid w16 w16cex w16sdtdh w16sdtfl w16du wp14">
   <w:body>
     <w:p>
       <w:pPr>
@@ -6294,8 +6294,12 @@
       </w:pPr>
     </w:p>
     <w:sectPr>
-      <w:headerReference w:type="default" r:id="rId15"/>
-      <w:footerReference w:type="default" r:id="rId16"/>
+      <w:headerReference w:type="even" r:id="rId15"/>
+      <w:headerReference w:type="default" r:id="rId16"/>
+      <w:footerReference w:type="even" r:id="rId17"/>
+      <w:footerReference w:type="default" r:id="rId18"/>
+      <w:headerReference w:type="first" r:id="rId19"/>
+      <w:footerReference w:type="first" r:id="rId20"/>
       <w:pgSz w:w="11906" w:h="16838"/>
       <w:pgMar w:top="1417" w:right="1701" w:bottom="1417" w:left="1701" w:header="708" w:footer="708" w:gutter="0"/>
       <w:cols w:space="708"/>
@@ -6306,7 +6310,7 @@
 </file>
 
 <file path=word/comments.xml><?xml version="1.0" encoding="utf-8"?>
-<w:comments xmlns:wpc="http://schemas.microsoft.com/office/word/2010/wordprocessingCanvas" xmlns:cx="http://schemas.microsoft.com/office/drawing/2014/chartex" xmlns:cx1="http://schemas.microsoft.com/office/drawing/2015/9/8/chartex" xmlns:cx2="http://schemas.microsoft.com/office/drawing/2015/10/21/chartex" xmlns:cx3="http://schemas.microsoft.com/office/drawing/2016/5/9/chartex" xmlns:cx4="http://schemas.microsoft.com/office/drawing/2016/5/10/chartex" xmlns:cx5="http://schemas.microsoft.com/office/drawing/2016/5/11/chartex" xmlns:cx6="http://schemas.microsoft.com/office/drawing/2016/5/12/chartex" xmlns:cx7="http://schemas.microsoft.com/office/drawing/2016/5/13/chartex" xmlns:cx8="http://schemas.microsoft.com/office/drawing/2016/5/14/chartex" xmlns:mc="http://schemas.openxmlformats.org/markup-compatibility/2006" xmlns:aink="http://schemas.microsoft.com/office/drawing/2016/ink" xmlns:am3d="http://schemas.microsoft.com/office/drawing/2017/model3d" xmlns:o="urn:schemas-microsoft-com:office:office" xmlns:oel="http://schemas.microsoft.com/office/2019/extlst" xmlns:r="http://schemas.openxmlformats.org/officeDocument/2006/relationships" xmlns:m="http://schemas.openxmlformats.org/officeDocument/2006/math" xmlns:v="urn:schemas-microsoft-com:vml" xmlns:wp14="http://schemas.microsoft.com/office/word/2010/wordprocessingDrawing" xmlns:wp="http://schemas.openxmlformats.org/drawingml/2006/wordprocessingDrawing" xmlns:w10="urn:schemas-microsoft-com:office:word" xmlns:w="http://schemas.openxmlformats.org/wordprocessingml/2006/main" xmlns:w14="http://schemas.microsoft.com/office/word/2010/wordml" xmlns:w15="http://schemas.microsoft.com/office/word/2012/wordml" xmlns:w16cex="http://schemas.microsoft.com/office/word/2018/wordml/cex" xmlns:w16cid="http://schemas.microsoft.com/office/word/2016/wordml/cid" xmlns:w16="http://schemas.microsoft.com/office/word/2018/wordml" xmlns:w16du="http://schemas.microsoft.com/office/word/2023/wordml/word16du" xmlns:w16sdtdh="http://schemas.microsoft.com/office/word/2020/wordml/sdtdatahash" xmlns:w16se="http://schemas.microsoft.com/office/word/2015/wordml/symex" xmlns:wpg="http://schemas.microsoft.com/office/word/2010/wordprocessingGroup" xmlns:wpi="http://schemas.microsoft.com/office/word/2010/wordprocessingInk" xmlns:wne="http://schemas.microsoft.com/office/word/2006/wordml" xmlns:wps="http://schemas.microsoft.com/office/word/2010/wordprocessingShape" mc:Ignorable="w14 w15 w16se w16cid w16 w16cex w16sdtdh w16du wp14">
+<w:comments xmlns:wpc="http://schemas.microsoft.com/office/word/2010/wordprocessingCanvas" xmlns:cx="http://schemas.microsoft.com/office/drawing/2014/chartex" xmlns:cx1="http://schemas.microsoft.com/office/drawing/2015/9/8/chartex" xmlns:cx2="http://schemas.microsoft.com/office/drawing/2015/10/21/chartex" xmlns:cx3="http://schemas.microsoft.com/office/drawing/2016/5/9/chartex" xmlns:cx4="http://schemas.microsoft.com/office/drawing/2016/5/10/chartex" xmlns:cx5="http://schemas.microsoft.com/office/drawing/2016/5/11/chartex" xmlns:cx6="http://schemas.microsoft.com/office/drawing/2016/5/12/chartex" xmlns:cx7="http://schemas.microsoft.com/office/drawing/2016/5/13/chartex" xmlns:cx8="http://schemas.microsoft.com/office/drawing/2016/5/14/chartex" xmlns:mc="http://schemas.openxmlformats.org/markup-compatibility/2006" xmlns:aink="http://schemas.microsoft.com/office/drawing/2016/ink" xmlns:am3d="http://schemas.microsoft.com/office/drawing/2017/model3d" xmlns:o="urn:schemas-microsoft-com:office:office" xmlns:oel="http://schemas.microsoft.com/office/2019/extlst" xmlns:r="http://schemas.openxmlformats.org/officeDocument/2006/relationships" xmlns:m="http://schemas.openxmlformats.org/officeDocument/2006/math" xmlns:v="urn:schemas-microsoft-com:vml" xmlns:wp14="http://schemas.microsoft.com/office/word/2010/wordprocessingDrawing" xmlns:wp="http://schemas.openxmlformats.org/drawingml/2006/wordprocessingDrawing" xmlns:w10="urn:schemas-microsoft-com:office:word" xmlns:w="http://schemas.openxmlformats.org/wordprocessingml/2006/main" xmlns:w14="http://schemas.microsoft.com/office/word/2010/wordml" xmlns:w15="http://schemas.microsoft.com/office/word/2012/wordml" xmlns:w16cex="http://schemas.microsoft.com/office/word/2018/wordml/cex" xmlns:w16cid="http://schemas.microsoft.com/office/word/2016/wordml/cid" xmlns:w16="http://schemas.microsoft.com/office/word/2018/wordml" xmlns:w16du="http://schemas.microsoft.com/office/word/2023/wordml/word16du" xmlns:w16sdtdh="http://schemas.microsoft.com/office/word/2020/wordml/sdtdatahash" xmlns:w16sdtfl="http://schemas.microsoft.com/office/word/2024/wordml/sdtformatlock" xmlns:w16se="http://schemas.microsoft.com/office/word/2015/wordml/symex" xmlns:wpg="http://schemas.microsoft.com/office/word/2010/wordprocessingGroup" xmlns:wpi="http://schemas.microsoft.com/office/word/2010/wordprocessingInk" xmlns:wne="http://schemas.microsoft.com/office/word/2006/wordml" xmlns:wps="http://schemas.microsoft.com/office/word/2010/wordprocessingShape" mc:Ignorable="w14 w15 w16se w16cid w16 w16cex w16sdtdh w16sdtfl w16du wp14">
   <w:comment w:id="0" w:author="AMA" w:date="2024-04-04T11:44:00Z" w:initials="AMA">
     <w:p>
       <w:pPr>
@@ -6359,7 +6363,7 @@
 </file>
 
 <file path=word/commentsExtended.xml><?xml version="1.0" encoding="utf-8"?>
-<w15:commentsEx xmlns:wpc="http://schemas.microsoft.com/office/word/2010/wordprocessingCanvas" xmlns:cx="http://schemas.microsoft.com/office/drawing/2014/chartex" xmlns:cx1="http://schemas.microsoft.com/office/drawing/2015/9/8/chartex" xmlns:cx2="http://schemas.microsoft.com/office/drawing/2015/10/21/chartex" xmlns:cx3="http://schemas.microsoft.com/office/drawing/2016/5/9/chartex" xmlns:cx4="http://schemas.microsoft.com/office/drawing/2016/5/10/chartex" xmlns:cx5="http://schemas.microsoft.com/office/drawing/2016/5/11/chartex" xmlns:cx6="http://schemas.microsoft.com/office/drawing/2016/5/12/chartex" xmlns:cx7="http://schemas.microsoft.com/office/drawing/2016/5/13/chartex" xmlns:cx8="http://schemas.microsoft.com/office/drawing/2016/5/14/chartex" xmlns:mc="http://schemas.openxmlformats.org/markup-compatibility/2006" xmlns:aink="http://schemas.microsoft.com/office/drawing/2016/ink" xmlns:am3d="http://schemas.microsoft.com/office/drawing/2017/model3d" xmlns:o="urn:schemas-microsoft-com:office:office" xmlns:oel="http://schemas.microsoft.com/office/2019/extlst" xmlns:r="http://schemas.openxmlformats.org/officeDocument/2006/relationships" xmlns:m="http://schemas.openxmlformats.org/officeDocument/2006/math" xmlns:v="urn:schemas-microsoft-com:vml" xmlns:wp14="http://schemas.microsoft.com/office/word/2010/wordprocessingDrawing" xmlns:wp="http://schemas.openxmlformats.org/drawingml/2006/wordprocessingDrawing" xmlns:w10="urn:schemas-microsoft-com:office:word" xmlns:w="http://schemas.openxmlformats.org/wordprocessingml/2006/main" xmlns:w14="http://schemas.microsoft.com/office/word/2010/wordml" xmlns:w15="http://schemas.microsoft.com/office/word/2012/wordml" xmlns:w16cex="http://schemas.microsoft.com/office/word/2018/wordml/cex" xmlns:w16cid="http://schemas.microsoft.com/office/word/2016/wordml/cid" xmlns:w16="http://schemas.microsoft.com/office/word/2018/wordml" xmlns:w16du="http://schemas.microsoft.com/office/word/2023/wordml/word16du" xmlns:w16sdtdh="http://schemas.microsoft.com/office/word/2020/wordml/sdtdatahash" xmlns:w16se="http://schemas.microsoft.com/office/word/2015/wordml/symex" xmlns:wpg="http://schemas.microsoft.com/office/word/2010/wordprocessingGroup" xmlns:wpi="http://schemas.microsoft.com/office/word/2010/wordprocessingInk" xmlns:wne="http://schemas.microsoft.com/office/word/2006/wordml" xmlns:wps="http://schemas.microsoft.com/office/word/2010/wordprocessingShape" mc:Ignorable="w14 w15 w16se w16cid w16 w16cex w16sdtdh w16du wp14">
+<w15:commentsEx xmlns:wpc="http://schemas.microsoft.com/office/word/2010/wordprocessingCanvas" xmlns:cx="http://schemas.microsoft.com/office/drawing/2014/chartex" xmlns:cx1="http://schemas.microsoft.com/office/drawing/2015/9/8/chartex" xmlns:cx2="http://schemas.microsoft.com/office/drawing/2015/10/21/chartex" xmlns:cx3="http://schemas.microsoft.com/office/drawing/2016/5/9/chartex" xmlns:cx4="http://schemas.microsoft.com/office/drawing/2016/5/10/chartex" xmlns:cx5="http://schemas.microsoft.com/office/drawing/2016/5/11/chartex" xmlns:cx6="http://schemas.microsoft.com/office/drawing/2016/5/12/chartex" xmlns:cx7="http://schemas.microsoft.com/office/drawing/2016/5/13/chartex" xmlns:cx8="http://schemas.microsoft.com/office/drawing/2016/5/14/chartex" xmlns:mc="http://schemas.openxmlformats.org/markup-compatibility/2006" xmlns:aink="http://schemas.microsoft.com/office/drawing/2016/ink" xmlns:am3d="http://schemas.microsoft.com/office/drawing/2017/model3d" xmlns:o="urn:schemas-microsoft-com:office:office" xmlns:oel="http://schemas.microsoft.com/office/2019/extlst" xmlns:r="http://schemas.openxmlformats.org/officeDocument/2006/relationships" xmlns:m="http://schemas.openxmlformats.org/officeDocument/2006/math" xmlns:v="urn:schemas-microsoft-com:vml" xmlns:wp14="http://schemas.microsoft.com/office/word/2010/wordprocessingDrawing" xmlns:wp="http://schemas.openxmlformats.org/drawingml/2006/wordprocessingDrawing" xmlns:w10="urn:schemas-microsoft-com:office:word" xmlns:w="http://schemas.openxmlformats.org/wordprocessingml/2006/main" xmlns:w14="http://schemas.microsoft.com/office/word/2010/wordml" xmlns:w15="http://schemas.microsoft.com/office/word/2012/wordml" xmlns:w16cex="http://schemas.microsoft.com/office/word/2018/wordml/cex" xmlns:w16cid="http://schemas.microsoft.com/office/word/2016/wordml/cid" xmlns:w16="http://schemas.microsoft.com/office/word/2018/wordml" xmlns:w16du="http://schemas.microsoft.com/office/word/2023/wordml/word16du" xmlns:w16sdtdh="http://schemas.microsoft.com/office/word/2020/wordml/sdtdatahash" xmlns:w16sdtfl="http://schemas.microsoft.com/office/word/2024/wordml/sdtformatlock" xmlns:w16se="http://schemas.microsoft.com/office/word/2015/wordml/symex" xmlns:wpg="http://schemas.microsoft.com/office/word/2010/wordprocessingGroup" xmlns:wpi="http://schemas.microsoft.com/office/word/2010/wordprocessingInk" xmlns:wne="http://schemas.microsoft.com/office/word/2006/wordml" xmlns:wps="http://schemas.microsoft.com/office/word/2010/wordprocessingShape" mc:Ignorable="w14 w15 w16se w16cid w16 w16cex w16sdtdh w16sdtfl w16du wp14">
   <w15:commentEx w15:paraId="3F791C26" w15:done="0"/>
   <w15:commentEx w15:paraId="4A03ED20" w15:done="0"/>
   <w15:commentEx w15:paraId="67AE8EE6" w15:done="0"/>
@@ -6367,7 +6371,7 @@
 </file>
 
 <file path=word/commentsExtensible.xml><?xml version="1.0" encoding="utf-8"?>
-<w16cex:commentsExtensible xmlns:wpc="http://schemas.microsoft.com/office/word/2010/wordprocessingCanvas" xmlns:cx="http://schemas.microsoft.com/office/drawing/2014/chartex" xmlns:cx1="http://schemas.microsoft.com/office/drawing/2015/9/8/chartex" xmlns:cx2="http://schemas.microsoft.com/office/drawing/2015/10/21/chartex" xmlns:cx3="http://schemas.microsoft.com/office/drawing/2016/5/9/chartex" xmlns:cx4="http://schemas.microsoft.com/office/drawing/2016/5/10/chartex" xmlns:cx5="http://schemas.microsoft.com/office/drawing/2016/5/11/chartex" xmlns:cx6="http://schemas.microsoft.com/office/drawing/2016/5/12/chartex" xmlns:cx7="http://schemas.microsoft.com/office/drawing/2016/5/13/chartex" xmlns:cx8="http://schemas.microsoft.com/office/drawing/2016/5/14/chartex" xmlns:cr="http://schemas.microsoft.com/office/comments/2020/reactions" xmlns:mc="http://schemas.openxmlformats.org/markup-compatibility/2006" xmlns:aink="http://schemas.microsoft.com/office/drawing/2016/ink" xmlns:am3d="http://schemas.microsoft.com/office/drawing/2017/model3d" xmlns:o="urn:schemas-microsoft-com:office:office" xmlns:oel="http://schemas.microsoft.com/office/2019/extlst" xmlns:r="http://schemas.openxmlformats.org/officeDocument/2006/relationships" xmlns:m="http://schemas.openxmlformats.org/officeDocument/2006/math" xmlns:v="urn:schemas-microsoft-com:vml" xmlns:wp14="http://schemas.microsoft.com/office/word/2010/wordprocessingDrawing" xmlns:wp="http://schemas.openxmlformats.org/drawingml/2006/wordprocessingDrawing" xmlns:w10="urn:schemas-microsoft-com:office:word" xmlns:w="http://schemas.openxmlformats.org/wordprocessingml/2006/main" xmlns:w14="http://schemas.microsoft.com/office/word/2010/wordml" xmlns:w15="http://schemas.microsoft.com/office/word/2012/wordml" xmlns:w16cex="http://schemas.microsoft.com/office/word/2018/wordml/cex" xmlns:w16cid="http://schemas.microsoft.com/office/word/2016/wordml/cid" xmlns:w16="http://schemas.microsoft.com/office/word/2018/wordml" xmlns:w16du="http://schemas.microsoft.com/office/word/2023/wordml/word16du" xmlns:w16sdtdh="http://schemas.microsoft.com/office/word/2020/wordml/sdtdatahash" xmlns:w16se="http://schemas.microsoft.com/office/word/2015/wordml/symex" xmlns:wpg="http://schemas.microsoft.com/office/word/2010/wordprocessingGroup" xmlns:wpi="http://schemas.microsoft.com/office/word/2010/wordprocessingInk" xmlns:wne="http://schemas.microsoft.com/office/word/2006/wordml" xmlns:wps="http://schemas.microsoft.com/office/word/2010/wordprocessingShape" mc:Ignorable="w14 w15 w16se w16cid w16 w16cex w16sdtdh cr w16du wp14">
+<w16cex:commentsExtensible xmlns:wpc="http://schemas.microsoft.com/office/word/2010/wordprocessingCanvas" xmlns:cx="http://schemas.microsoft.com/office/drawing/2014/chartex" xmlns:cx1="http://schemas.microsoft.com/office/drawing/2015/9/8/chartex" xmlns:cx2="http://schemas.microsoft.com/office/drawing/2015/10/21/chartex" xmlns:cx3="http://schemas.microsoft.com/office/drawing/2016/5/9/chartex" xmlns:cx4="http://schemas.microsoft.com/office/drawing/2016/5/10/chartex" xmlns:cx5="http://schemas.microsoft.com/office/drawing/2016/5/11/chartex" xmlns:cx6="http://schemas.microsoft.com/office/drawing/2016/5/12/chartex" xmlns:cx7="http://schemas.microsoft.com/office/drawing/2016/5/13/chartex" xmlns:cx8="http://schemas.microsoft.com/office/drawing/2016/5/14/chartex" xmlns:cr="http://schemas.microsoft.com/office/comments/2020/reactions" xmlns:mc="http://schemas.openxmlformats.org/markup-compatibility/2006" xmlns:aink="http://schemas.microsoft.com/office/drawing/2016/ink" xmlns:am3d="http://schemas.microsoft.com/office/drawing/2017/model3d" xmlns:o="urn:schemas-microsoft-com:office:office" xmlns:oel="http://schemas.microsoft.com/office/2019/extlst" xmlns:r="http://schemas.openxmlformats.org/officeDocument/2006/relationships" xmlns:m="http://schemas.openxmlformats.org/officeDocument/2006/math" xmlns:v="urn:schemas-microsoft-com:vml" xmlns:wp14="http://schemas.microsoft.com/office/word/2010/wordprocessingDrawing" xmlns:wp="http://schemas.openxmlformats.org/drawingml/2006/wordprocessingDrawing" xmlns:w10="urn:schemas-microsoft-com:office:word" xmlns:w="http://schemas.openxmlformats.org/wordprocessingml/2006/main" xmlns:w14="http://schemas.microsoft.com/office/word/2010/wordml" xmlns:w15="http://schemas.microsoft.com/office/word/2012/wordml" xmlns:w16cex="http://schemas.microsoft.com/office/word/2018/wordml/cex" xmlns:w16cid="http://schemas.microsoft.com/office/word/2016/wordml/cid" xmlns:w16="http://schemas.microsoft.com/office/word/2018/wordml" xmlns:w16du="http://schemas.microsoft.com/office/word/2023/wordml/word16du" xmlns:w16sdtdh="http://schemas.microsoft.com/office/word/2020/wordml/sdtdatahash" xmlns:w16sdtfl="http://schemas.microsoft.com/office/word/2024/wordml/sdtformatlock" xmlns:w16se="http://schemas.microsoft.com/office/word/2015/wordml/symex" xmlns:wpg="http://schemas.microsoft.com/office/word/2010/wordprocessingGroup" xmlns:wpi="http://schemas.microsoft.com/office/word/2010/wordprocessingInk" xmlns:wne="http://schemas.microsoft.com/office/word/2006/wordml" xmlns:wps="http://schemas.microsoft.com/office/word/2010/wordprocessingShape" mc:Ignorable="w14 w15 w16se w16cid w16 w16cex w16sdtdh w16sdtfl cr w16du wp14">
   <w16cex:commentExtensible w16cex:durableId="71B6CFF6" w16cex:dateUtc="2024-04-04T10:44:00Z"/>
   <w16cex:commentExtensible w16cex:durableId="75D33B3A" w16cex:dateUtc="2024-04-04T10:09:00Z"/>
   <w16cex:commentExtensible w16cex:durableId="154AB323" w16cex:dateUtc="2024-04-04T10:10:00Z"/>
@@ -6375,7 +6379,7 @@
 </file>
 
 <file path=word/commentsIds.xml><?xml version="1.0" encoding="utf-8"?>
-<w16cid:commentsIds xmlns:wpc="http://schemas.microsoft.com/office/word/2010/wordprocessingCanvas" xmlns:cx="http://schemas.microsoft.com/office/drawing/2014/chartex" xmlns:cx1="http://schemas.microsoft.com/office/drawing/2015/9/8/chartex" xmlns:cx2="http://schemas.microsoft.com/office/drawing/2015/10/21/chartex" xmlns:cx3="http://schemas.microsoft.com/office/drawing/2016/5/9/chartex" xmlns:cx4="http://schemas.microsoft.com/office/drawing/2016/5/10/chartex" xmlns:cx5="http://schemas.microsoft.com/office/drawing/2016/5/11/chartex" xmlns:cx6="http://schemas.microsoft.com/office/drawing/2016/5/12/chartex" xmlns:cx7="http://schemas.microsoft.com/office/drawing/2016/5/13/chartex" xmlns:cx8="http://schemas.microsoft.com/office/drawing/2016/5/14/chartex" xmlns:mc="http://schemas.openxmlformats.org/markup-compatibility/2006" xmlns:aink="http://schemas.microsoft.com/office/drawing/2016/ink" xmlns:am3d="http://schemas.microsoft.com/office/drawing/2017/model3d" xmlns:o="urn:schemas-microsoft-com:office:office" xmlns:oel="http://schemas.microsoft.com/office/2019/extlst" xmlns:r="http://schemas.openxmlformats.org/officeDocument/2006/relationships" xmlns:m="http://schemas.openxmlformats.org/officeDocument/2006/math" xmlns:v="urn:schemas-microsoft-com:vml" xmlns:wp14="http://schemas.microsoft.com/office/word/2010/wordprocessingDrawing" xmlns:wp="http://schemas.openxmlformats.org/drawingml/2006/wordprocessingDrawing" xmlns:w10="urn:schemas-microsoft-com:office:word" xmlns:w="http://schemas.openxmlformats.org/wordprocessingml/2006/main" xmlns:w14="http://schemas.microsoft.com/office/word/2010/wordml" xmlns:w15="http://schemas.microsoft.com/office/word/2012/wordml" xmlns:w16cex="http://schemas.microsoft.com/office/word/2018/wordml/cex" xmlns:w16cid="http://schemas.microsoft.com/office/word/2016/wordml/cid" xmlns:w16="http://schemas.microsoft.com/office/word/2018/wordml" xmlns:w16du="http://schemas.microsoft.com/office/word/2023/wordml/word16du" xmlns:w16sdtdh="http://schemas.microsoft.com/office/word/2020/wordml/sdtdatahash" xmlns:w16se="http://schemas.microsoft.com/office/word/2015/wordml/symex" xmlns:wpg="http://schemas.microsoft.com/office/word/2010/wordprocessingGroup" xmlns:wpi="http://schemas.microsoft.com/office/word/2010/wordprocessingInk" xmlns:wne="http://schemas.microsoft.com/office/word/2006/wordml" xmlns:wps="http://schemas.microsoft.com/office/word/2010/wordprocessingShape" mc:Ignorable="w14 w15 w16se w16cid w16 w16cex w16sdtdh w16du wp14">
+<w16cid:commentsIds xmlns:wpc="http://schemas.microsoft.com/office/word/2010/wordprocessingCanvas" xmlns:cx="http://schemas.microsoft.com/office/drawing/2014/chartex" xmlns:cx1="http://schemas.microsoft.com/office/drawing/2015/9/8/chartex" xmlns:cx2="http://schemas.microsoft.com/office/drawing/2015/10/21/chartex" xmlns:cx3="http://schemas.microsoft.com/office/drawing/2016/5/9/chartex" xmlns:cx4="http://schemas.microsoft.com/office/drawing/2016/5/10/chartex" xmlns:cx5="http://schemas.microsoft.com/office/drawing/2016/5/11/chartex" xmlns:cx6="http://schemas.microsoft.com/office/drawing/2016/5/12/chartex" xmlns:cx7="http://schemas.microsoft.com/office/drawing/2016/5/13/chartex" xmlns:cx8="http://schemas.microsoft.com/office/drawing/2016/5/14/chartex" xmlns:mc="http://schemas.openxmlformats.org/markup-compatibility/2006" xmlns:aink="http://schemas.microsoft.com/office/drawing/2016/ink" xmlns:am3d="http://schemas.microsoft.com/office/drawing/2017/model3d" xmlns:o="urn:schemas-microsoft-com:office:office" xmlns:oel="http://schemas.microsoft.com/office/2019/extlst" xmlns:r="http://schemas.openxmlformats.org/officeDocument/2006/relationships" xmlns:m="http://schemas.openxmlformats.org/officeDocument/2006/math" xmlns:v="urn:schemas-microsoft-com:vml" xmlns:wp14="http://schemas.microsoft.com/office/word/2010/wordprocessingDrawing" xmlns:wp="http://schemas.openxmlformats.org/drawingml/2006/wordprocessingDrawing" xmlns:w10="urn:schemas-microsoft-com:office:word" xmlns:w="http://schemas.openxmlformats.org/wordprocessingml/2006/main" xmlns:w14="http://schemas.microsoft.com/office/word/2010/wordml" xmlns:w15="http://schemas.microsoft.com/office/word/2012/wordml" xmlns:w16cex="http://schemas.microsoft.com/office/word/2018/wordml/cex" xmlns:w16cid="http://schemas.microsoft.com/office/word/2016/wordml/cid" xmlns:w16="http://schemas.microsoft.com/office/word/2018/wordml" xmlns:w16du="http://schemas.microsoft.com/office/word/2023/wordml/word16du" xmlns:w16sdtdh="http://schemas.microsoft.com/office/word/2020/wordml/sdtdatahash" xmlns:w16sdtfl="http://schemas.microsoft.com/office/word/2024/wordml/sdtformatlock" xmlns:w16se="http://schemas.microsoft.com/office/word/2015/wordml/symex" xmlns:wpg="http://schemas.microsoft.com/office/word/2010/wordprocessingGroup" xmlns:wpi="http://schemas.microsoft.com/office/word/2010/wordprocessingInk" xmlns:wne="http://schemas.microsoft.com/office/word/2006/wordml" xmlns:wps="http://schemas.microsoft.com/office/word/2010/wordprocessingShape" mc:Ignorable="w14 w15 w16se w16cid w16 w16cex w16sdtdh w16sdtfl w16du wp14">
   <w16cid:commentId w16cid:paraId="3F791C26" w16cid:durableId="71B6CFF6"/>
   <w16cid:commentId w16cid:paraId="4A03ED20" w16cid:durableId="75D33B3A"/>
   <w16cid:commentId w16cid:paraId="67AE8EE6" w16cid:durableId="154AB323"/>
@@ -6383,7 +6387,7 @@
 </file>
 
 <file path=word/endnotes.xml><?xml version="1.0" encoding="utf-8"?>
-<w:endnotes xmlns:wpc="http://schemas.microsoft.com/office/word/2010/wordprocessingCanvas" xmlns:cx="http://schemas.microsoft.com/office/drawing/2014/chartex" xmlns:cx1="http://schemas.microsoft.com/office/drawing/2015/9/8/chartex" xmlns:cx2="http://schemas.microsoft.com/office/drawing/2015/10/21/chartex" xmlns:cx3="http://schemas.microsoft.com/office/drawing/2016/5/9/chartex" xmlns:cx4="http://schemas.microsoft.com/office/drawing/2016/5/10/chartex" xmlns:cx5="http://schemas.microsoft.com/office/drawing/2016/5/11/chartex" xmlns:cx6="http://schemas.microsoft.com/office/drawing/2016/5/12/chartex" xmlns:cx7="http://schemas.microsoft.com/office/drawing/2016/5/13/chartex" xmlns:cx8="http://schemas.microsoft.com/office/drawing/2016/5/14/chartex" xmlns:mc="http://schemas.openxmlformats.org/markup-compatibility/2006" xmlns:aink="http://schemas.microsoft.com/office/drawing/2016/ink" xmlns:am3d="http://schemas.microsoft.com/office/drawing/2017/model3d" xmlns:o="urn:schemas-microsoft-com:office:office" xmlns:oel="http://schemas.microsoft.com/office/2019/extlst" xmlns:r="http://schemas.openxmlformats.org/officeDocument/2006/relationships" xmlns:m="http://schemas.openxmlformats.org/officeDocument/2006/math" xmlns:v="urn:schemas-microsoft-com:vml" xmlns:wp14="http://schemas.microsoft.com/office/word/2010/wordprocessingDrawing" xmlns:wp="http://schemas.openxmlformats.org/drawingml/2006/wordprocessingDrawing" xmlns:w10="urn:schemas-microsoft-com:office:word" xmlns:w="http://schemas.openxmlformats.org/wordprocessingml/2006/main" xmlns:w14="http://schemas.microsoft.com/office/word/2010/wordml" xmlns:w15="http://schemas.microsoft.com/office/word/2012/wordml" xmlns:w16cex="http://schemas.microsoft.com/office/word/2018/wordml/cex" xmlns:w16cid="http://schemas.microsoft.com/office/word/2016/wordml/cid" xmlns:w16="http://schemas.microsoft.com/office/word/2018/wordml" xmlns:w16du="http://schemas.microsoft.com/office/word/2023/wordml/word16du" xmlns:w16sdtdh="http://schemas.microsoft.com/office/word/2020/wordml/sdtdatahash" xmlns:w16se="http://schemas.microsoft.com/office/word/2015/wordml/symex" xmlns:wpg="http://schemas.microsoft.com/office/word/2010/wordprocessingGroup" xmlns:wpi="http://schemas.microsoft.com/office/word/2010/wordprocessingInk" xmlns:wne="http://schemas.microsoft.com/office/word/2006/wordml" xmlns:wps="http://schemas.microsoft.com/office/word/2010/wordprocessingShape" mc:Ignorable="w14 w15 w16se w16cid w16 w16cex w16sdtdh w16du wp14">
+<w:endnotes xmlns:wpc="http://schemas.microsoft.com/office/word/2010/wordprocessingCanvas" xmlns:cx="http://schemas.microsoft.com/office/drawing/2014/chartex" xmlns:cx1="http://schemas.microsoft.com/office/drawing/2015/9/8/chartex" xmlns:cx2="http://schemas.microsoft.com/office/drawing/2015/10/21/chartex" xmlns:cx3="http://schemas.microsoft.com/office/drawing/2016/5/9/chartex" xmlns:cx4="http://schemas.microsoft.com/office/drawing/2016/5/10/chartex" xmlns:cx5="http://schemas.microsoft.com/office/drawing/2016/5/11/chartex" xmlns:cx6="http://schemas.microsoft.com/office/drawing/2016/5/12/chartex" xmlns:cx7="http://schemas.microsoft.com/office/drawing/2016/5/13/chartex" xmlns:cx8="http://schemas.microsoft.com/office/drawing/2016/5/14/chartex" xmlns:mc="http://schemas.openxmlformats.org/markup-compatibility/2006" xmlns:aink="http://schemas.microsoft.com/office/drawing/2016/ink" xmlns:am3d="http://schemas.microsoft.com/office/drawing/2017/model3d" xmlns:o="urn:schemas-microsoft-com:office:office" xmlns:oel="http://schemas.microsoft.com/office/2019/extlst" xmlns:r="http://schemas.openxmlformats.org/officeDocument/2006/relationships" xmlns:m="http://schemas.openxmlformats.org/officeDocument/2006/math" xmlns:v="urn:schemas-microsoft-com:vml" xmlns:wp14="http://schemas.microsoft.com/office/word/2010/wordprocessingDrawing" xmlns:wp="http://schemas.openxmlformats.org/drawingml/2006/wordprocessingDrawing" xmlns:w10="urn:schemas-microsoft-com:office:word" xmlns:w="http://schemas.openxmlformats.org/wordprocessingml/2006/main" xmlns:w14="http://schemas.microsoft.com/office/word/2010/wordml" xmlns:w15="http://schemas.microsoft.com/office/word/2012/wordml" xmlns:w16cex="http://schemas.microsoft.com/office/word/2018/wordml/cex" xmlns:w16cid="http://schemas.microsoft.com/office/word/2016/wordml/cid" xmlns:w16="http://schemas.microsoft.com/office/word/2018/wordml" xmlns:w16du="http://schemas.microsoft.com/office/word/2023/wordml/word16du" xmlns:w16sdtdh="http://schemas.microsoft.com/office/word/2020/wordml/sdtdatahash" xmlns:w16sdtfl="http://schemas.microsoft.com/office/word/2024/wordml/sdtformatlock" xmlns:w16se="http://schemas.microsoft.com/office/word/2015/wordml/symex" xmlns:wpg="http://schemas.microsoft.com/office/word/2010/wordprocessingGroup" xmlns:wpi="http://schemas.microsoft.com/office/word/2010/wordprocessingInk" xmlns:wne="http://schemas.microsoft.com/office/word/2006/wordml" xmlns:wps="http://schemas.microsoft.com/office/word/2010/wordprocessingShape" mc:Ignorable="w14 w15 w16se w16cid w16 w16cex w16sdtdh w16sdtfl w16du wp14">
   <w:endnote w:type="separator" w:id="-1">
     <w:p>
       <w:pPr>
@@ -6408,7 +6412,17 @@
 </file>
 
 <file path=word/footer1.xml><?xml version="1.0" encoding="utf-8"?>
-<w:ftr xmlns:wpc="http://schemas.microsoft.com/office/word/2010/wordprocessingCanvas" xmlns:cx="http://schemas.microsoft.com/office/drawing/2014/chartex" xmlns:cx1="http://schemas.microsoft.com/office/drawing/2015/9/8/chartex" xmlns:cx2="http://schemas.microsoft.com/office/drawing/2015/10/21/chartex" xmlns:cx3="http://schemas.microsoft.com/office/drawing/2016/5/9/chartex" xmlns:cx4="http://schemas.microsoft.com/office/drawing/2016/5/10/chartex" xmlns:cx5="http://schemas.microsoft.com/office/drawing/2016/5/11/chartex" xmlns:cx6="http://schemas.microsoft.com/office/drawing/2016/5/12/chartex" xmlns:cx7="http://schemas.microsoft.com/office/drawing/2016/5/13/chartex" xmlns:cx8="http://schemas.microsoft.com/office/drawing/2016/5/14/chartex" xmlns:mc="http://schemas.openxmlformats.org/markup-compatibility/2006" xmlns:aink="http://schemas.microsoft.com/office/drawing/2016/ink" xmlns:am3d="http://schemas.microsoft.com/office/drawing/2017/model3d" xmlns:o="urn:schemas-microsoft-com:office:office" xmlns:oel="http://schemas.microsoft.com/office/2019/extlst" xmlns:r="http://schemas.openxmlformats.org/officeDocument/2006/relationships" xmlns:m="http://schemas.openxmlformats.org/officeDocument/2006/math" xmlns:v="urn:schemas-microsoft-com:vml" xmlns:wp14="http://schemas.microsoft.com/office/word/2010/wordprocessingDrawing" xmlns:wp="http://schemas.openxmlformats.org/drawingml/2006/wordprocessingDrawing" xmlns:w10="urn:schemas-microsoft-com:office:word" xmlns:w="http://schemas.openxmlformats.org/wordprocessingml/2006/main" xmlns:w14="http://schemas.microsoft.com/office/word/2010/wordml" xmlns:w15="http://schemas.microsoft.com/office/word/2012/wordml" xmlns:w16cex="http://schemas.microsoft.com/office/word/2018/wordml/cex" xmlns:w16cid="http://schemas.microsoft.com/office/word/2016/wordml/cid" xmlns:w16="http://schemas.microsoft.com/office/word/2018/wordml" xmlns:w16du="http://schemas.microsoft.com/office/word/2023/wordml/word16du" xmlns:w16sdtdh="http://schemas.microsoft.com/office/word/2020/wordml/sdtdatahash" xmlns:w16se="http://schemas.microsoft.com/office/word/2015/wordml/symex" xmlns:wpg="http://schemas.microsoft.com/office/word/2010/wordprocessingGroup" xmlns:wpi="http://schemas.microsoft.com/office/word/2010/wordprocessingInk" xmlns:wne="http://schemas.microsoft.com/office/word/2006/wordml" xmlns:wps="http://schemas.microsoft.com/office/word/2010/wordprocessingShape" mc:Ignorable="w14 w15 w16se w16cid w16 w16cex w16sdtdh w16du wp14">
+<w:ftr xmlns:wpc="http://schemas.microsoft.com/office/word/2010/wordprocessingCanvas" xmlns:cx="http://schemas.microsoft.com/office/drawing/2014/chartex" xmlns:cx1="http://schemas.microsoft.com/office/drawing/2015/9/8/chartex" xmlns:cx2="http://schemas.microsoft.com/office/drawing/2015/10/21/chartex" xmlns:cx3="http://schemas.microsoft.com/office/drawing/2016/5/9/chartex" xmlns:cx4="http://schemas.microsoft.com/office/drawing/2016/5/10/chartex" xmlns:cx5="http://schemas.microsoft.com/office/drawing/2016/5/11/chartex" xmlns:cx6="http://schemas.microsoft.com/office/drawing/2016/5/12/chartex" xmlns:cx7="http://schemas.microsoft.com/office/drawing/2016/5/13/chartex" xmlns:cx8="http://schemas.microsoft.com/office/drawing/2016/5/14/chartex" xmlns:mc="http://schemas.openxmlformats.org/markup-compatibility/2006" xmlns:aink="http://schemas.microsoft.com/office/drawing/2016/ink" xmlns:am3d="http://schemas.microsoft.com/office/drawing/2017/model3d" xmlns:o="urn:schemas-microsoft-com:office:office" xmlns:oel="http://schemas.microsoft.com/office/2019/extlst" xmlns:r="http://schemas.openxmlformats.org/officeDocument/2006/relationships" xmlns:m="http://schemas.openxmlformats.org/officeDocument/2006/math" xmlns:v="urn:schemas-microsoft-com:vml" xmlns:wp14="http://schemas.microsoft.com/office/word/2010/wordprocessingDrawing" xmlns:wp="http://schemas.openxmlformats.org/drawingml/2006/wordprocessingDrawing" xmlns:w10="urn:schemas-microsoft-com:office:word" xmlns:w="http://schemas.openxmlformats.org/wordprocessingml/2006/main" xmlns:w14="http://schemas.microsoft.com/office/word/2010/wordml" xmlns:w15="http://schemas.microsoft.com/office/word/2012/wordml" xmlns:w16cex="http://schemas.microsoft.com/office/word/2018/wordml/cex" xmlns:w16cid="http://schemas.microsoft.com/office/word/2016/wordml/cid" xmlns:w16="http://schemas.microsoft.com/office/word/2018/wordml" xmlns:w16du="http://schemas.microsoft.com/office/word/2023/wordml/word16du" xmlns:w16sdtdh="http://schemas.microsoft.com/office/word/2020/wordml/sdtdatahash" xmlns:w16sdtfl="http://schemas.microsoft.com/office/word/2024/wordml/sdtformatlock" xmlns:w16se="http://schemas.microsoft.com/office/word/2015/wordml/symex" xmlns:wpg="http://schemas.microsoft.com/office/word/2010/wordprocessingGroup" xmlns:wpi="http://schemas.microsoft.com/office/word/2010/wordprocessingInk" xmlns:wne="http://schemas.microsoft.com/office/word/2006/wordml" xmlns:wps="http://schemas.microsoft.com/office/word/2010/wordprocessingShape" mc:Ignorable="w14 w15 w16se w16cid w16 w16cex w16sdtdh w16sdtfl w16du wp14">
+  <w:p>
+    <w:pPr>
+      <w:pStyle w:val="Footer"/>
+    </w:pPr>
+  </w:p>
+</w:ftr>
+</file>
+
+<file path=word/footer2.xml><?xml version="1.0" encoding="utf-8"?>
+<w:ftr xmlns:wpc="http://schemas.microsoft.com/office/word/2010/wordprocessingCanvas" xmlns:cx="http://schemas.microsoft.com/office/drawing/2014/chartex" xmlns:cx1="http://schemas.microsoft.com/office/drawing/2015/9/8/chartex" xmlns:cx2="http://schemas.microsoft.com/office/drawing/2015/10/21/chartex" xmlns:cx3="http://schemas.microsoft.com/office/drawing/2016/5/9/chartex" xmlns:cx4="http://schemas.microsoft.com/office/drawing/2016/5/10/chartex" xmlns:cx5="http://schemas.microsoft.com/office/drawing/2016/5/11/chartex" xmlns:cx6="http://schemas.microsoft.com/office/drawing/2016/5/12/chartex" xmlns:cx7="http://schemas.microsoft.com/office/drawing/2016/5/13/chartex" xmlns:cx8="http://schemas.microsoft.com/office/drawing/2016/5/14/chartex" xmlns:mc="http://schemas.openxmlformats.org/markup-compatibility/2006" xmlns:aink="http://schemas.microsoft.com/office/drawing/2016/ink" xmlns:am3d="http://schemas.microsoft.com/office/drawing/2017/model3d" xmlns:o="urn:schemas-microsoft-com:office:office" xmlns:oel="http://schemas.microsoft.com/office/2019/extlst" xmlns:r="http://schemas.openxmlformats.org/officeDocument/2006/relationships" xmlns:m="http://schemas.openxmlformats.org/officeDocument/2006/math" xmlns:v="urn:schemas-microsoft-com:vml" xmlns:wp14="http://schemas.microsoft.com/office/word/2010/wordprocessingDrawing" xmlns:wp="http://schemas.openxmlformats.org/drawingml/2006/wordprocessingDrawing" xmlns:w10="urn:schemas-microsoft-com:office:word" xmlns:w="http://schemas.openxmlformats.org/wordprocessingml/2006/main" xmlns:w14="http://schemas.microsoft.com/office/word/2010/wordml" xmlns:w15="http://schemas.microsoft.com/office/word/2012/wordml" xmlns:w16cex="http://schemas.microsoft.com/office/word/2018/wordml/cex" xmlns:w16cid="http://schemas.microsoft.com/office/word/2016/wordml/cid" xmlns:w16="http://schemas.microsoft.com/office/word/2018/wordml" xmlns:w16du="http://schemas.microsoft.com/office/word/2023/wordml/word16du" xmlns:w16sdtdh="http://schemas.microsoft.com/office/word/2020/wordml/sdtdatahash" xmlns:w16sdtfl="http://schemas.microsoft.com/office/word/2024/wordml/sdtformatlock" xmlns:w16se="http://schemas.microsoft.com/office/word/2015/wordml/symex" xmlns:wpg="http://schemas.microsoft.com/office/word/2010/wordprocessingGroup" xmlns:wpi="http://schemas.microsoft.com/office/word/2010/wordprocessingInk" xmlns:wne="http://schemas.microsoft.com/office/word/2006/wordml" xmlns:wps="http://schemas.microsoft.com/office/word/2010/wordprocessingShape" mc:Ignorable="w14 w15 w16se w16cid w16 w16cex w16sdtdh w16sdtfl w16du wp14">
   <w:p>
     <w:pPr>
       <w:pStyle w:val="Footer"/>
@@ -6735,8 +6749,18 @@
 </w:ftr>
 </file>
 
+<file path=word/footer3.xml><?xml version="1.0" encoding="utf-8"?>
+<w:ftr xmlns:wpc="http://schemas.microsoft.com/office/word/2010/wordprocessingCanvas" xmlns:cx="http://schemas.microsoft.com/office/drawing/2014/chartex" xmlns:cx1="http://schemas.microsoft.com/office/drawing/2015/9/8/chartex" xmlns:cx2="http://schemas.microsoft.com/office/drawing/2015/10/21/chartex" xmlns:cx3="http://schemas.microsoft.com/office/drawing/2016/5/9/chartex" xmlns:cx4="http://schemas.microsoft.com/office/drawing/2016/5/10/chartex" xmlns:cx5="http://schemas.microsoft.com/office/drawing/2016/5/11/chartex" xmlns:cx6="http://schemas.microsoft.com/office/drawing/2016/5/12/chartex" xmlns:cx7="http://schemas.microsoft.com/office/drawing/2016/5/13/chartex" xmlns:cx8="http://schemas.microsoft.com/office/drawing/2016/5/14/chartex" xmlns:mc="http://schemas.openxmlformats.org/markup-compatibility/2006" xmlns:aink="http://schemas.microsoft.com/office/drawing/2016/ink" xmlns:am3d="http://schemas.microsoft.com/office/drawing/2017/model3d" xmlns:o="urn:schemas-microsoft-com:office:office" xmlns:oel="http://schemas.microsoft.com/office/2019/extlst" xmlns:r="http://schemas.openxmlformats.org/officeDocument/2006/relationships" xmlns:m="http://schemas.openxmlformats.org/officeDocument/2006/math" xmlns:v="urn:schemas-microsoft-com:vml" xmlns:wp14="http://schemas.microsoft.com/office/word/2010/wordprocessingDrawing" xmlns:wp="http://schemas.openxmlformats.org/drawingml/2006/wordprocessingDrawing" xmlns:w10="urn:schemas-microsoft-com:office:word" xmlns:w="http://schemas.openxmlformats.org/wordprocessingml/2006/main" xmlns:w14="http://schemas.microsoft.com/office/word/2010/wordml" xmlns:w15="http://schemas.microsoft.com/office/word/2012/wordml" xmlns:w16cex="http://schemas.microsoft.com/office/word/2018/wordml/cex" xmlns:w16cid="http://schemas.microsoft.com/office/word/2016/wordml/cid" xmlns:w16="http://schemas.microsoft.com/office/word/2018/wordml" xmlns:w16du="http://schemas.microsoft.com/office/word/2023/wordml/word16du" xmlns:w16sdtdh="http://schemas.microsoft.com/office/word/2020/wordml/sdtdatahash" xmlns:w16sdtfl="http://schemas.microsoft.com/office/word/2024/wordml/sdtformatlock" xmlns:w16se="http://schemas.microsoft.com/office/word/2015/wordml/symex" xmlns:wpg="http://schemas.microsoft.com/office/word/2010/wordprocessingGroup" xmlns:wpi="http://schemas.microsoft.com/office/word/2010/wordprocessingInk" xmlns:wne="http://schemas.microsoft.com/office/word/2006/wordml" xmlns:wps="http://schemas.microsoft.com/office/word/2010/wordprocessingShape" mc:Ignorable="w14 w15 w16se w16cid w16 w16cex w16sdtdh w16sdtfl w16du wp14">
+  <w:p>
+    <w:pPr>
+      <w:pStyle w:val="Footer"/>
+    </w:pPr>
+  </w:p>
+</w:ftr>
+</file>
+
 <file path=word/footnotes.xml><?xml version="1.0" encoding="utf-8"?>
-<w:footnotes xmlns:wpc="http://schemas.microsoft.com/office/word/2010/wordprocessingCanvas" xmlns:cx="http://schemas.microsoft.com/office/drawing/2014/chartex" xmlns:cx1="http://schemas.microsoft.com/office/drawing/2015/9/8/chartex" xmlns:cx2="http://schemas.microsoft.com/office/drawing/2015/10/21/chartex" xmlns:cx3="http://schemas.microsoft.com/office/drawing/2016/5/9/chartex" xmlns:cx4="http://schemas.microsoft.com/office/drawing/2016/5/10/chartex" xmlns:cx5="http://schemas.microsoft.com/office/drawing/2016/5/11/chartex" xmlns:cx6="http://schemas.microsoft.com/office/drawing/2016/5/12/chartex" xmlns:cx7="http://schemas.microsoft.com/office/drawing/2016/5/13/chartex" xmlns:cx8="http://schemas.microsoft.com/office/drawing/2016/5/14/chartex" xmlns:mc="http://schemas.openxmlformats.org/markup-compatibility/2006" xmlns:aink="http://schemas.microsoft.com/office/drawing/2016/ink" xmlns:am3d="http://schemas.microsoft.com/office/drawing/2017/model3d" xmlns:o="urn:schemas-microsoft-com:office:office" xmlns:oel="http://schemas.microsoft.com/office/2019/extlst" xmlns:r="http://schemas.openxmlformats.org/officeDocument/2006/relationships" xmlns:m="http://schemas.openxmlformats.org/officeDocument/2006/math" xmlns:v="urn:schemas-microsoft-com:vml" xmlns:wp14="http://schemas.microsoft.com/office/word/2010/wordprocessingDrawing" xmlns:wp="http://schemas.openxmlformats.org/drawingml/2006/wordprocessingDrawing" xmlns:w10="urn:schemas-microsoft-com:office:word" xmlns:w="http://schemas.openxmlformats.org/wordprocessingml/2006/main" xmlns:w14="http://schemas.microsoft.com/office/word/2010/wordml" xmlns:w15="http://schemas.microsoft.com/office/word/2012/wordml" xmlns:w16cex="http://schemas.microsoft.com/office/word/2018/wordml/cex" xmlns:w16cid="http://schemas.microsoft.com/office/word/2016/wordml/cid" xmlns:w16="http://schemas.microsoft.com/office/word/2018/wordml" xmlns:w16du="http://schemas.microsoft.com/office/word/2023/wordml/word16du" xmlns:w16sdtdh="http://schemas.microsoft.com/office/word/2020/wordml/sdtdatahash" xmlns:w16se="http://schemas.microsoft.com/office/word/2015/wordml/symex" xmlns:wpg="http://schemas.microsoft.com/office/word/2010/wordprocessingGroup" xmlns:wpi="http://schemas.microsoft.com/office/word/2010/wordprocessingInk" xmlns:wne="http://schemas.microsoft.com/office/word/2006/wordml" xmlns:wps="http://schemas.microsoft.com/office/word/2010/wordprocessingShape" mc:Ignorable="w14 w15 w16se w16cid w16 w16cex w16sdtdh w16du wp14">
+<w:footnotes xmlns:wpc="http://schemas.microsoft.com/office/word/2010/wordprocessingCanvas" xmlns:cx="http://schemas.microsoft.com/office/drawing/2014/chartex" xmlns:cx1="http://schemas.microsoft.com/office/drawing/2015/9/8/chartex" xmlns:cx2="http://schemas.microsoft.com/office/drawing/2015/10/21/chartex" xmlns:cx3="http://schemas.microsoft.com/office/drawing/2016/5/9/chartex" xmlns:cx4="http://schemas.microsoft.com/office/drawing/2016/5/10/chartex" xmlns:cx5="http://schemas.microsoft.com/office/drawing/2016/5/11/chartex" xmlns:cx6="http://schemas.microsoft.com/office/drawing/2016/5/12/chartex" xmlns:cx7="http://schemas.microsoft.com/office/drawing/2016/5/13/chartex" xmlns:cx8="http://schemas.microsoft.com/office/drawing/2016/5/14/chartex" xmlns:mc="http://schemas.openxmlformats.org/markup-compatibility/2006" xmlns:aink="http://schemas.microsoft.com/office/drawing/2016/ink" xmlns:am3d="http://schemas.microsoft.com/office/drawing/2017/model3d" xmlns:o="urn:schemas-microsoft-com:office:office" xmlns:oel="http://schemas.microsoft.com/office/2019/extlst" xmlns:r="http://schemas.openxmlformats.org/officeDocument/2006/relationships" xmlns:m="http://schemas.openxmlformats.org/officeDocument/2006/math" xmlns:v="urn:schemas-microsoft-com:vml" xmlns:wp14="http://schemas.microsoft.com/office/word/2010/wordprocessingDrawing" xmlns:wp="http://schemas.openxmlformats.org/drawingml/2006/wordprocessingDrawing" xmlns:w10="urn:schemas-microsoft-com:office:word" xmlns:w="http://schemas.openxmlformats.org/wordprocessingml/2006/main" xmlns:w14="http://schemas.microsoft.com/office/word/2010/wordml" xmlns:w15="http://schemas.microsoft.com/office/word/2012/wordml" xmlns:w16cex="http://schemas.microsoft.com/office/word/2018/wordml/cex" xmlns:w16cid="http://schemas.microsoft.com/office/word/2016/wordml/cid" xmlns:w16="http://schemas.microsoft.com/office/word/2018/wordml" xmlns:w16du="http://schemas.microsoft.com/office/word/2023/wordml/word16du" xmlns:w16sdtdh="http://schemas.microsoft.com/office/word/2020/wordml/sdtdatahash" xmlns:w16sdtfl="http://schemas.microsoft.com/office/word/2024/wordml/sdtformatlock" xmlns:w16se="http://schemas.microsoft.com/office/word/2015/wordml/symex" xmlns:wpg="http://schemas.microsoft.com/office/word/2010/wordprocessingGroup" xmlns:wpi="http://schemas.microsoft.com/office/word/2010/wordprocessingInk" xmlns:wne="http://schemas.microsoft.com/office/word/2006/wordml" xmlns:wps="http://schemas.microsoft.com/office/word/2010/wordprocessingShape" mc:Ignorable="w14 w15 w16se w16cid w16 w16cex w16sdtdh w16sdtfl w16du wp14">
   <w:footnote w:type="separator" w:id="-1">
     <w:p>
       <w:pPr>
@@ -6876,18 +6900,31 @@
         </w:rPr>
         <w:t xml:space="preserve"> Identificar quais as medidas de segurança que deverão ser aplicadas aos dados conforme formulário disponibilizado pela CNPD em </w:t>
       </w:r>
-      <w:hyperlink r:id="rId2" w:history="1">
-        <w:r>
-          <w:rPr>
-            <w:rStyle w:val="Hyperlink"/>
-            <w:rFonts w:ascii="Aptos" w:hAnsi="Aptos" w:cstheme="minorHAnsi"/>
-            <w:sz w:val="16"/>
-            <w:szCs w:val="16"/>
-            <w:lang w:val="pt-PT"/>
-          </w:rPr>
-          <w:t>https://www.cnpd.pt/media/cltpq4bn/templatedocrgpd_sub_v1.xlsx</w:t>
-        </w:r>
-      </w:hyperlink>
+      <w:r>
+        <w:fldChar w:fldCharType="begin"/>
+      </w:r>
+      <w:r>
+        <w:rPr>
+          <w:lang w:val="pt-PT"/>
+        </w:rPr>
+        <w:instrText>HYPERLINK "https://www.cnpd.pt/media/cltpq4bn/templatedocrgpd_sub_v1.xlsx"</w:instrText>
+      </w:r>
+      <w:r>
+        <w:fldChar w:fldCharType="separate"/>
+      </w:r>
+      <w:r>
+        <w:rPr>
+          <w:rStyle w:val="Hyperlink"/>
+          <w:rFonts w:ascii="Aptos" w:hAnsi="Aptos" w:cstheme="minorHAnsi"/>
+          <w:sz w:val="16"/>
+          <w:szCs w:val="16"/>
+          <w:lang w:val="pt-PT"/>
+        </w:rPr>
+        <w:t>https://www.cnpd.pt/media/cltpq4bn/templatedocrgpd_sub_v1.xlsx</w:t>
+      </w:r>
+      <w:r>
+        <w:fldChar w:fldCharType="end"/>
+      </w:r>
       <w:r>
         <w:rPr>
           <w:rFonts w:ascii="Aptos" w:hAnsi="Aptos" w:cs="Calibri"/>
@@ -6926,25 +6963,48 @@
         </w:rPr>
         <w:t xml:space="preserve"> Se aplicável, conforme formulário disponibilizado pela CNPD em </w:t>
       </w:r>
-      <w:hyperlink r:id="rId3" w:history="1">
-        <w:r>
-          <w:rPr>
-            <w:rStyle w:val="Hyperlink"/>
-            <w:rFonts w:ascii="Aptos" w:hAnsi="Aptos" w:cstheme="minorHAnsi"/>
-            <w:sz w:val="16"/>
-            <w:szCs w:val="16"/>
-            <w:lang w:val="pt-PT"/>
-          </w:rPr>
-          <w:t>https://www.cnpd.pt/media/cltpq4bn/templatedocrgpd_sub_v1.xlsx</w:t>
-        </w:r>
-      </w:hyperlink>
+      <w:r>
+        <w:fldChar w:fldCharType="begin"/>
+      </w:r>
+      <w:r>
+        <w:rPr>
+          <w:lang w:val="pt-PT"/>
+        </w:rPr>
+        <w:instrText>HYPERLINK "https://www.cnpd.pt/media/cltpq4bn/templatedocrgpd_sub_v1.xlsx"</w:instrText>
+      </w:r>
+      <w:r>
+        <w:fldChar w:fldCharType="separate"/>
+      </w:r>
+      <w:r>
+        <w:rPr>
+          <w:rStyle w:val="Hyperlink"/>
+          <w:rFonts w:ascii="Aptos" w:hAnsi="Aptos" w:cstheme="minorHAnsi"/>
+          <w:sz w:val="16"/>
+          <w:szCs w:val="16"/>
+          <w:lang w:val="pt-PT"/>
+        </w:rPr>
+        <w:t>https://www.cnpd.pt/media/cltpq4bn/templatedocrgpd_sub_v1.xlsx</w:t>
+      </w:r>
+      <w:r>
+        <w:fldChar w:fldCharType="end"/>
+      </w:r>
     </w:p>
   </w:footnote>
 </w:footnotes>
 </file>
 
 <file path=word/header1.xml><?xml version="1.0" encoding="utf-8"?>
-<w:hdr xmlns:wpc="http://schemas.microsoft.com/office/word/2010/wordprocessingCanvas" xmlns:cx="http://schemas.microsoft.com/office/drawing/2014/chartex" xmlns:cx1="http://schemas.microsoft.com/office/drawing/2015/9/8/chartex" xmlns:cx2="http://schemas.microsoft.com/office/drawing/2015/10/21/chartex" xmlns:cx3="http://schemas.microsoft.com/office/drawing/2016/5/9/chartex" xmlns:cx4="http://schemas.microsoft.com/office/drawing/2016/5/10/chartex" xmlns:cx5="http://schemas.microsoft.com/office/drawing/2016/5/11/chartex" xmlns:cx6="http://schemas.microsoft.com/office/drawing/2016/5/12/chartex" xmlns:cx7="http://schemas.microsoft.com/office/drawing/2016/5/13/chartex" xmlns:cx8="http://schemas.microsoft.com/office/drawing/2016/5/14/chartex" xmlns:mc="http://schemas.openxmlformats.org/markup-compatibility/2006" xmlns:aink="http://schemas.microsoft.com/office/drawing/2016/ink" xmlns:am3d="http://schemas.microsoft.com/office/drawing/2017/model3d" xmlns:o="urn:schemas-microsoft-com:office:office" xmlns:oel="http://schemas.microsoft.com/office/2019/extlst" xmlns:r="http://schemas.openxmlformats.org/officeDocument/2006/relationships" xmlns:m="http://schemas.openxmlformats.org/officeDocument/2006/math" xmlns:v="urn:schemas-microsoft-com:vml" xmlns:wp14="http://schemas.microsoft.com/office/word/2010/wordprocessingDrawing" xmlns:wp="http://schemas.openxmlformats.org/drawingml/2006/wordprocessingDrawing" xmlns:w10="urn:schemas-microsoft-com:office:word" xmlns:w="http://schemas.openxmlformats.org/wordprocessingml/2006/main" xmlns:w14="http://schemas.microsoft.com/office/word/2010/wordml" xmlns:w15="http://schemas.microsoft.com/office/word/2012/wordml" xmlns:w16cex="http://schemas.microsoft.com/office/word/2018/wordml/cex" xmlns:w16cid="http://schemas.microsoft.com/office/word/2016/wordml/cid" xmlns:w16="http://schemas.microsoft.com/office/word/2018/wordml" xmlns:w16du="http://schemas.microsoft.com/office/word/2023/wordml/word16du" xmlns:w16sdtdh="http://schemas.microsoft.com/office/word/2020/wordml/sdtdatahash" xmlns:w16se="http://schemas.microsoft.com/office/word/2015/wordml/symex" xmlns:wpg="http://schemas.microsoft.com/office/word/2010/wordprocessingGroup" xmlns:wpi="http://schemas.microsoft.com/office/word/2010/wordprocessingInk" xmlns:wne="http://schemas.microsoft.com/office/word/2006/wordml" xmlns:wps="http://schemas.microsoft.com/office/word/2010/wordprocessingShape" mc:Ignorable="w14 w15 w16se w16cid w16 w16cex w16sdtdh w16du wp14">
+<w:hdr xmlns:wpc="http://schemas.microsoft.com/office/word/2010/wordprocessingCanvas" xmlns:cx="http://schemas.microsoft.com/office/drawing/2014/chartex" xmlns:cx1="http://schemas.microsoft.com/office/drawing/2015/9/8/chartex" xmlns:cx2="http://schemas.microsoft.com/office/drawing/2015/10/21/chartex" xmlns:cx3="http://schemas.microsoft.com/office/drawing/2016/5/9/chartex" xmlns:cx4="http://schemas.microsoft.com/office/drawing/2016/5/10/chartex" xmlns:cx5="http://schemas.microsoft.com/office/drawing/2016/5/11/chartex" xmlns:cx6="http://schemas.microsoft.com/office/drawing/2016/5/12/chartex" xmlns:cx7="http://schemas.microsoft.com/office/drawing/2016/5/13/chartex" xmlns:cx8="http://schemas.microsoft.com/office/drawing/2016/5/14/chartex" xmlns:mc="http://schemas.openxmlformats.org/markup-compatibility/2006" xmlns:aink="http://schemas.microsoft.com/office/drawing/2016/ink" xmlns:am3d="http://schemas.microsoft.com/office/drawing/2017/model3d" xmlns:o="urn:schemas-microsoft-com:office:office" xmlns:oel="http://schemas.microsoft.com/office/2019/extlst" xmlns:r="http://schemas.openxmlformats.org/officeDocument/2006/relationships" xmlns:m="http://schemas.openxmlformats.org/officeDocument/2006/math" xmlns:v="urn:schemas-microsoft-com:vml" xmlns:wp14="http://schemas.microsoft.com/office/word/2010/wordprocessingDrawing" xmlns:wp="http://schemas.openxmlformats.org/drawingml/2006/wordprocessingDrawing" xmlns:w10="urn:schemas-microsoft-com:office:word" xmlns:w="http://schemas.openxmlformats.org/wordprocessingml/2006/main" xmlns:w14="http://schemas.microsoft.com/office/word/2010/wordml" xmlns:w15="http://schemas.microsoft.com/office/word/2012/wordml" xmlns:w16cex="http://schemas.microsoft.com/office/word/2018/wordml/cex" xmlns:w16cid="http://schemas.microsoft.com/office/word/2016/wordml/cid" xmlns:w16="http://schemas.microsoft.com/office/word/2018/wordml" xmlns:w16du="http://schemas.microsoft.com/office/word/2023/wordml/word16du" xmlns:w16sdtdh="http://schemas.microsoft.com/office/word/2020/wordml/sdtdatahash" xmlns:w16sdtfl="http://schemas.microsoft.com/office/word/2024/wordml/sdtformatlock" xmlns:w16se="http://schemas.microsoft.com/office/word/2015/wordml/symex" xmlns:wpg="http://schemas.microsoft.com/office/word/2010/wordprocessingGroup" xmlns:wpi="http://schemas.microsoft.com/office/word/2010/wordprocessingInk" xmlns:wne="http://schemas.microsoft.com/office/word/2006/wordml" xmlns:wps="http://schemas.microsoft.com/office/word/2010/wordprocessingShape" mc:Ignorable="w14 w15 w16se w16cid w16 w16cex w16sdtdh w16sdtfl w16du wp14">
+  <w:p>
+    <w:pPr>
+      <w:pStyle w:val="Header"/>
+    </w:pPr>
+  </w:p>
+</w:hdr>
+</file>
+
+<file path=word/header2.xml><?xml version="1.0" encoding="utf-8"?>
+<w:hdr xmlns:wpc="http://schemas.microsoft.com/office/word/2010/wordprocessingCanvas" xmlns:cx="http://schemas.microsoft.com/office/drawing/2014/chartex" xmlns:cx1="http://schemas.microsoft.com/office/drawing/2015/9/8/chartex" xmlns:cx2="http://schemas.microsoft.com/office/drawing/2015/10/21/chartex" xmlns:cx3="http://schemas.microsoft.com/office/drawing/2016/5/9/chartex" xmlns:cx4="http://schemas.microsoft.com/office/drawing/2016/5/10/chartex" xmlns:cx5="http://schemas.microsoft.com/office/drawing/2016/5/11/chartex" xmlns:cx6="http://schemas.microsoft.com/office/drawing/2016/5/12/chartex" xmlns:cx7="http://schemas.microsoft.com/office/drawing/2016/5/13/chartex" xmlns:cx8="http://schemas.microsoft.com/office/drawing/2016/5/14/chartex" xmlns:mc="http://schemas.openxmlformats.org/markup-compatibility/2006" xmlns:aink="http://schemas.microsoft.com/office/drawing/2016/ink" xmlns:am3d="http://schemas.microsoft.com/office/drawing/2017/model3d" xmlns:o="urn:schemas-microsoft-com:office:office" xmlns:oel="http://schemas.microsoft.com/office/2019/extlst" xmlns:r="http://schemas.openxmlformats.org/officeDocument/2006/relationships" xmlns:m="http://schemas.openxmlformats.org/officeDocument/2006/math" xmlns:v="urn:schemas-microsoft-com:vml" xmlns:wp14="http://schemas.microsoft.com/office/word/2010/wordprocessingDrawing" xmlns:wp="http://schemas.openxmlformats.org/drawingml/2006/wordprocessingDrawing" xmlns:w10="urn:schemas-microsoft-com:office:word" xmlns:w="http://schemas.openxmlformats.org/wordprocessingml/2006/main" xmlns:w14="http://schemas.microsoft.com/office/word/2010/wordml" xmlns:w15="http://schemas.microsoft.com/office/word/2012/wordml" xmlns:w16cex="http://schemas.microsoft.com/office/word/2018/wordml/cex" xmlns:w16cid="http://schemas.microsoft.com/office/word/2016/wordml/cid" xmlns:w16="http://schemas.microsoft.com/office/word/2018/wordml" xmlns:w16du="http://schemas.microsoft.com/office/word/2023/wordml/word16du" xmlns:w16sdtdh="http://schemas.microsoft.com/office/word/2020/wordml/sdtdatahash" xmlns:w16sdtfl="http://schemas.microsoft.com/office/word/2024/wordml/sdtformatlock" xmlns:w16se="http://schemas.microsoft.com/office/word/2015/wordml/symex" xmlns:wpg="http://schemas.microsoft.com/office/word/2010/wordprocessingGroup" xmlns:wpi="http://schemas.microsoft.com/office/word/2010/wordprocessingInk" xmlns:wne="http://schemas.microsoft.com/office/word/2006/wordml" xmlns:wps="http://schemas.microsoft.com/office/word/2010/wordprocessingShape" mc:Ignorable="w14 w15 w16se w16cid w16 w16cex w16sdtdh w16sdtfl w16du wp14">
   <w:p>
     <w:pPr>
       <w:pStyle w:val="Header"/>
@@ -7022,6 +7082,15 @@
   <w:p>
     <w:pPr>
       <w:pStyle w:val="Header"/>
+      <w:tabs>
+        <w:tab w:val="clear" w:pos="8504"/>
+        <w:tab w:val="right" w:pos="9638"/>
+      </w:tabs>
+      <w:rPr>
+        <w:rFonts w:cstheme="minorHAnsi"/>
+      </w:rPr>
+    </w:pPr>
+    <w:r>
       <w:rPr>
         <w:rFonts w:cs="Arial"/>
         <w:b/>
@@ -7030,7 +7099,32 @@
         <w:color w:val="595959" w:themeColor="text1" w:themeTint="A6"/>
         <w:lang w:eastAsia="pt-PT"/>
       </w:rPr>
-    </w:pPr>
+      <w:tab/>
+    </w:r>
+    <w:r>
+      <w:rPr>
+        <w:rFonts w:cs="Arial"/>
+        <w:b/>
+        <w:bCs/>
+        <w:caps/>
+        <w:color w:val="595959" w:themeColor="text1" w:themeTint="A6"/>
+        <w:lang w:eastAsia="pt-PT"/>
+      </w:rPr>
+      <w:tab/>
+    </w:r>
+    <w:r>
+      <w:rPr>
+        <w:rFonts w:cstheme="minorHAnsi"/>
+        <w:lang w:eastAsia="pt-PT"/>
+      </w:rPr>
+      <w:t xml:space="preserve">      [</w:t>
+    </w:r>
+    <w:r>
+      <w:rPr>
+        <w:rFonts w:cstheme="minorHAnsi"/>
+      </w:rPr>
+      <w:t>Espaço para logotipo do parceiro]</w:t>
+    </w:r>
   </w:p>
   <w:p>
     <w:pPr>
@@ -7359,8 +7453,18 @@
 </w:hdr>
 </file>
 
+<file path=word/header3.xml><?xml version="1.0" encoding="utf-8"?>
+<w:hdr xmlns:wpc="http://schemas.microsoft.com/office/word/2010/wordprocessingCanvas" xmlns:cx="http://schemas.microsoft.com/office/drawing/2014/chartex" xmlns:cx1="http://schemas.microsoft.com/office/drawing/2015/9/8/chartex" xmlns:cx2="http://schemas.microsoft.com/office/drawing/2015/10/21/chartex" xmlns:cx3="http://schemas.microsoft.com/office/drawing/2016/5/9/chartex" xmlns:cx4="http://schemas.microsoft.com/office/drawing/2016/5/10/chartex" xmlns:cx5="http://schemas.microsoft.com/office/drawing/2016/5/11/chartex" xmlns:cx6="http://schemas.microsoft.com/office/drawing/2016/5/12/chartex" xmlns:cx7="http://schemas.microsoft.com/office/drawing/2016/5/13/chartex" xmlns:cx8="http://schemas.microsoft.com/office/drawing/2016/5/14/chartex" xmlns:mc="http://schemas.openxmlformats.org/markup-compatibility/2006" xmlns:aink="http://schemas.microsoft.com/office/drawing/2016/ink" xmlns:am3d="http://schemas.microsoft.com/office/drawing/2017/model3d" xmlns:o="urn:schemas-microsoft-com:office:office" xmlns:oel="http://schemas.microsoft.com/office/2019/extlst" xmlns:r="http://schemas.openxmlformats.org/officeDocument/2006/relationships" xmlns:m="http://schemas.openxmlformats.org/officeDocument/2006/math" xmlns:v="urn:schemas-microsoft-com:vml" xmlns:wp14="http://schemas.microsoft.com/office/word/2010/wordprocessingDrawing" xmlns:wp="http://schemas.openxmlformats.org/drawingml/2006/wordprocessingDrawing" xmlns:w10="urn:schemas-microsoft-com:office:word" xmlns:w="http://schemas.openxmlformats.org/wordprocessingml/2006/main" xmlns:w14="http://schemas.microsoft.com/office/word/2010/wordml" xmlns:w15="http://schemas.microsoft.com/office/word/2012/wordml" xmlns:w16cex="http://schemas.microsoft.com/office/word/2018/wordml/cex" xmlns:w16cid="http://schemas.microsoft.com/office/word/2016/wordml/cid" xmlns:w16="http://schemas.microsoft.com/office/word/2018/wordml" xmlns:w16du="http://schemas.microsoft.com/office/word/2023/wordml/word16du" xmlns:w16sdtdh="http://schemas.microsoft.com/office/word/2020/wordml/sdtdatahash" xmlns:w16sdtfl="http://schemas.microsoft.com/office/word/2024/wordml/sdtformatlock" xmlns:w16se="http://schemas.microsoft.com/office/word/2015/wordml/symex" xmlns:wpg="http://schemas.microsoft.com/office/word/2010/wordprocessingGroup" xmlns:wpi="http://schemas.microsoft.com/office/word/2010/wordprocessingInk" xmlns:wne="http://schemas.microsoft.com/office/word/2006/wordml" xmlns:wps="http://schemas.microsoft.com/office/word/2010/wordprocessingShape" mc:Ignorable="w14 w15 w16se w16cid w16 w16cex w16sdtdh w16sdtfl w16du wp14">
+  <w:p>
+    <w:pPr>
+      <w:pStyle w:val="Header"/>
+    </w:pPr>
+  </w:p>
+</w:hdr>
+</file>
+
 <file path=word/numbering.xml><?xml version="1.0" encoding="utf-8"?>
-<w:numbering xmlns:wpc="http://schemas.microsoft.com/office/word/2010/wordprocessingCanvas" xmlns:cx="http://schemas.microsoft.com/office/drawing/2014/chartex" xmlns:cx1="http://schemas.microsoft.com/office/drawing/2015/9/8/chartex" xmlns:cx2="http://schemas.microsoft.com/office/drawing/2015/10/21/chartex" xmlns:cx3="http://schemas.microsoft.com/office/drawing/2016/5/9/chartex" xmlns:cx4="http://schemas.microsoft.com/office/drawing/2016/5/10/chartex" xmlns:cx5="http://schemas.microsoft.com/office/drawing/2016/5/11/chartex" xmlns:cx6="http://schemas.microsoft.com/office/drawing/2016/5/12/chartex" xmlns:cx7="http://schemas.microsoft.com/office/drawing/2016/5/13/chartex" xmlns:cx8="http://schemas.microsoft.com/office/drawing/2016/5/14/chartex" xmlns:mc="http://schemas.openxmlformats.org/markup-compatibility/2006" xmlns:aink="http://schemas.microsoft.com/office/drawing/2016/ink" xmlns:am3d="http://schemas.microsoft.com/office/drawing/2017/model3d" xmlns:o="urn:schemas-microsoft-com:office:office" xmlns:oel="http://schemas.microsoft.com/office/2019/extlst" xmlns:r="http://schemas.openxmlformats.org/officeDocument/2006/relationships" xmlns:m="http://schemas.openxmlformats.org/officeDocument/2006/math" xmlns:v="urn:schemas-microsoft-com:vml" xmlns:wp14="http://schemas.microsoft.com/office/word/2010/wordprocessingDrawing" xmlns:wp="http://schemas.openxmlformats.org/drawingml/2006/wordprocessingDrawing" xmlns:w10="urn:schemas-microsoft-com:office:word" xmlns:w="http://schemas.openxmlformats.org/wordprocessingml/2006/main" xmlns:w14="http://schemas.microsoft.com/office/word/2010/wordml" xmlns:w15="http://schemas.microsoft.com/office/word/2012/wordml" xmlns:w16cex="http://schemas.microsoft.com/office/word/2018/wordml/cex" xmlns:w16cid="http://schemas.microsoft.com/office/word/2016/wordml/cid" xmlns:w16="http://schemas.microsoft.com/office/word/2018/wordml" xmlns:w16du="http://schemas.microsoft.com/office/word/2023/wordml/word16du" xmlns:w16sdtdh="http://schemas.microsoft.com/office/word/2020/wordml/sdtdatahash" xmlns:w16se="http://schemas.microsoft.com/office/word/2015/wordml/symex" xmlns:wpg="http://schemas.microsoft.com/office/word/2010/wordprocessingGroup" xmlns:wpi="http://schemas.microsoft.com/office/word/2010/wordprocessingInk" xmlns:wne="http://schemas.microsoft.com/office/word/2006/wordml" xmlns:wps="http://schemas.microsoft.com/office/word/2010/wordprocessingShape" mc:Ignorable="w14 w15 w16se w16cid w16 w16cex w16sdtdh w16du wp14">
+<w:numbering xmlns:wpc="http://schemas.microsoft.com/office/word/2010/wordprocessingCanvas" xmlns:cx="http://schemas.microsoft.com/office/drawing/2014/chartex" xmlns:cx1="http://schemas.microsoft.com/office/drawing/2015/9/8/chartex" xmlns:cx2="http://schemas.microsoft.com/office/drawing/2015/10/21/chartex" xmlns:cx3="http://schemas.microsoft.com/office/drawing/2016/5/9/chartex" xmlns:cx4="http://schemas.microsoft.com/office/drawing/2016/5/10/chartex" xmlns:cx5="http://schemas.microsoft.com/office/drawing/2016/5/11/chartex" xmlns:cx6="http://schemas.microsoft.com/office/drawing/2016/5/12/chartex" xmlns:cx7="http://schemas.microsoft.com/office/drawing/2016/5/13/chartex" xmlns:cx8="http://schemas.microsoft.com/office/drawing/2016/5/14/chartex" xmlns:mc="http://schemas.openxmlformats.org/markup-compatibility/2006" xmlns:aink="http://schemas.microsoft.com/office/drawing/2016/ink" xmlns:am3d="http://schemas.microsoft.com/office/drawing/2017/model3d" xmlns:o="urn:schemas-microsoft-com:office:office" xmlns:oel="http://schemas.microsoft.com/office/2019/extlst" xmlns:r="http://schemas.openxmlformats.org/officeDocument/2006/relationships" xmlns:m="http://schemas.openxmlformats.org/officeDocument/2006/math" xmlns:v="urn:schemas-microsoft-com:vml" xmlns:wp14="http://schemas.microsoft.com/office/word/2010/wordprocessingDrawing" xmlns:wp="http://schemas.openxmlformats.org/drawingml/2006/wordprocessingDrawing" xmlns:w10="urn:schemas-microsoft-com:office:word" xmlns:w="http://schemas.openxmlformats.org/wordprocessingml/2006/main" xmlns:w14="http://schemas.microsoft.com/office/word/2010/wordml" xmlns:w15="http://schemas.microsoft.com/office/word/2012/wordml" xmlns:w16cex="http://schemas.microsoft.com/office/word/2018/wordml/cex" xmlns:w16cid="http://schemas.microsoft.com/office/word/2016/wordml/cid" xmlns:w16="http://schemas.microsoft.com/office/word/2018/wordml" xmlns:w16du="http://schemas.microsoft.com/office/word/2023/wordml/word16du" xmlns:w16sdtdh="http://schemas.microsoft.com/office/word/2020/wordml/sdtdatahash" xmlns:w16sdtfl="http://schemas.microsoft.com/office/word/2024/wordml/sdtformatlock" xmlns:w16se="http://schemas.microsoft.com/office/word/2015/wordml/symex" xmlns:wpg="http://schemas.microsoft.com/office/word/2010/wordprocessingGroup" xmlns:wpi="http://schemas.microsoft.com/office/word/2010/wordprocessingInk" xmlns:wne="http://schemas.microsoft.com/office/word/2006/wordml" xmlns:wps="http://schemas.microsoft.com/office/word/2010/wordprocessingShape" mc:Ignorable="w14 w15 w16se w16cid w16 w16cex w16sdtdh w16sdtfl w16du wp14">
   <w:abstractNum w:abstractNumId="0" w15:restartNumberingAfterBreak="0">
     <w:nsid w:val="04BA08DE"/>
     <w:multiLevelType w:val="hybridMultilevel"/>
@@ -10539,7 +10643,7 @@
 </file>
 
 <file path=word/people.xml><?xml version="1.0" encoding="utf-8"?>
-<w15:people xmlns:wpc="http://schemas.microsoft.com/office/word/2010/wordprocessingCanvas" xmlns:cx="http://schemas.microsoft.com/office/drawing/2014/chartex" xmlns:cx1="http://schemas.microsoft.com/office/drawing/2015/9/8/chartex" xmlns:cx2="http://schemas.microsoft.com/office/drawing/2015/10/21/chartex" xmlns:cx3="http://schemas.microsoft.com/office/drawing/2016/5/9/chartex" xmlns:cx4="http://schemas.microsoft.com/office/drawing/2016/5/10/chartex" xmlns:cx5="http://schemas.microsoft.com/office/drawing/2016/5/11/chartex" xmlns:cx6="http://schemas.microsoft.com/office/drawing/2016/5/12/chartex" xmlns:cx7="http://schemas.microsoft.com/office/drawing/2016/5/13/chartex" xmlns:cx8="http://schemas.microsoft.com/office/drawing/2016/5/14/chartex" xmlns:mc="http://schemas.openxmlformats.org/markup-compatibility/2006" xmlns:aink="http://schemas.microsoft.com/office/drawing/2016/ink" xmlns:am3d="http://schemas.microsoft.com/office/drawing/2017/model3d" xmlns:o="urn:schemas-microsoft-com:office:office" xmlns:oel="http://schemas.microsoft.com/office/2019/extlst" xmlns:r="http://schemas.openxmlformats.org/officeDocument/2006/relationships" xmlns:m="http://schemas.openxmlformats.org/officeDocument/2006/math" xmlns:v="urn:schemas-microsoft-com:vml" xmlns:wp14="http://schemas.microsoft.com/office/word/2010/wordprocessingDrawing" xmlns:wp="http://schemas.openxmlformats.org/drawingml/2006/wordprocessingDrawing" xmlns:w10="urn:schemas-microsoft-com:office:word" xmlns:w="http://schemas.openxmlformats.org/wordprocessingml/2006/main" xmlns:w14="http://schemas.microsoft.com/office/word/2010/wordml" xmlns:w15="http://schemas.microsoft.com/office/word/2012/wordml" xmlns:w16cex="http://schemas.microsoft.com/office/word/2018/wordml/cex" xmlns:w16cid="http://schemas.microsoft.com/office/word/2016/wordml/cid" xmlns:w16="http://schemas.microsoft.com/office/word/2018/wordml" xmlns:w16du="http://schemas.microsoft.com/office/word/2023/wordml/word16du" xmlns:w16sdtdh="http://schemas.microsoft.com/office/word/2020/wordml/sdtdatahash" xmlns:w16se="http://schemas.microsoft.com/office/word/2015/wordml/symex" xmlns:wpg="http://schemas.microsoft.com/office/word/2010/wordprocessingGroup" xmlns:wpi="http://schemas.microsoft.com/office/word/2010/wordprocessingInk" xmlns:wne="http://schemas.microsoft.com/office/word/2006/wordml" xmlns:wps="http://schemas.microsoft.com/office/word/2010/wordprocessingShape" mc:Ignorable="w14 w15 w16se w16cid w16 w16cex w16sdtdh w16du wp14">
+<w15:people xmlns:wpc="http://schemas.microsoft.com/office/word/2010/wordprocessingCanvas" xmlns:cx="http://schemas.microsoft.com/office/drawing/2014/chartex" xmlns:cx1="http://schemas.microsoft.com/office/drawing/2015/9/8/chartex" xmlns:cx2="http://schemas.microsoft.com/office/drawing/2015/10/21/chartex" xmlns:cx3="http://schemas.microsoft.com/office/drawing/2016/5/9/chartex" xmlns:cx4="http://schemas.microsoft.com/office/drawing/2016/5/10/chartex" xmlns:cx5="http://schemas.microsoft.com/office/drawing/2016/5/11/chartex" xmlns:cx6="http://schemas.microsoft.com/office/drawing/2016/5/12/chartex" xmlns:cx7="http://schemas.microsoft.com/office/drawing/2016/5/13/chartex" xmlns:cx8="http://schemas.microsoft.com/office/drawing/2016/5/14/chartex" xmlns:mc="http://schemas.openxmlformats.org/markup-compatibility/2006" xmlns:aink="http://schemas.microsoft.com/office/drawing/2016/ink" xmlns:am3d="http://schemas.microsoft.com/office/drawing/2017/model3d" xmlns:o="urn:schemas-microsoft-com:office:office" xmlns:oel="http://schemas.microsoft.com/office/2019/extlst" xmlns:r="http://schemas.openxmlformats.org/officeDocument/2006/relationships" xmlns:m="http://schemas.openxmlformats.org/officeDocument/2006/math" xmlns:v="urn:schemas-microsoft-com:vml" xmlns:wp14="http://schemas.microsoft.com/office/word/2010/wordprocessingDrawing" xmlns:wp="http://schemas.openxmlformats.org/drawingml/2006/wordprocessingDrawing" xmlns:w10="urn:schemas-microsoft-com:office:word" xmlns:w="http://schemas.openxmlformats.org/wordprocessingml/2006/main" xmlns:w14="http://schemas.microsoft.com/office/word/2010/wordml" xmlns:w15="http://schemas.microsoft.com/office/word/2012/wordml" xmlns:w16cex="http://schemas.microsoft.com/office/word/2018/wordml/cex" xmlns:w16cid="http://schemas.microsoft.com/office/word/2016/wordml/cid" xmlns:w16="http://schemas.microsoft.com/office/word/2018/wordml" xmlns:w16du="http://schemas.microsoft.com/office/word/2023/wordml/word16du" xmlns:w16sdtdh="http://schemas.microsoft.com/office/word/2020/wordml/sdtdatahash" xmlns:w16sdtfl="http://schemas.microsoft.com/office/word/2024/wordml/sdtformatlock" xmlns:w16se="http://schemas.microsoft.com/office/word/2015/wordml/symex" xmlns:wpg="http://schemas.microsoft.com/office/word/2010/wordprocessingGroup" xmlns:wpi="http://schemas.microsoft.com/office/word/2010/wordprocessingInk" xmlns:wne="http://schemas.microsoft.com/office/word/2006/wordml" xmlns:wps="http://schemas.microsoft.com/office/word/2010/wordprocessingShape" mc:Ignorable="w14 w15 w16se w16cid w16 w16cex w16sdtdh w16sdtfl w16du wp14">
   <w15:person w15:author="AMA">
     <w15:presenceInfo w15:providerId="None" w15:userId="AMA"/>
   </w15:person>
@@ -10547,7 +10651,7 @@
 </file>
 
 <file path=word/styles.xml><?xml version="1.0" encoding="utf-8"?>
-<w:styles xmlns:mc="http://schemas.openxmlformats.org/markup-compatibility/2006" xmlns:r="http://schemas.openxmlformats.org/officeDocument/2006/relationships" xmlns:w="http://schemas.openxmlformats.org/wordprocessingml/2006/main" xmlns:w14="http://schemas.microsoft.com/office/word/2010/wordml" xmlns:w15="http://schemas.microsoft.com/office/word/2012/wordml" xmlns:w16cex="http://schemas.microsoft.com/office/word/2018/wordml/cex" xmlns:w16cid="http://schemas.microsoft.com/office/word/2016/wordml/cid" xmlns:w16="http://schemas.microsoft.com/office/word/2018/wordml" xmlns:w16du="http://schemas.microsoft.com/office/word/2023/wordml/word16du" xmlns:w16sdtdh="http://schemas.microsoft.com/office/word/2020/wordml/sdtdatahash" xmlns:w16se="http://schemas.microsoft.com/office/word/2015/wordml/symex" mc:Ignorable="w14 w15 w16se w16cid w16 w16cex w16sdtdh w16du">
+<w:styles xmlns:mc="http://schemas.openxmlformats.org/markup-compatibility/2006" xmlns:r="http://schemas.openxmlformats.org/officeDocument/2006/relationships" xmlns:w="http://schemas.openxmlformats.org/wordprocessingml/2006/main" xmlns:w14="http://schemas.microsoft.com/office/word/2010/wordml" xmlns:w15="http://schemas.microsoft.com/office/word/2012/wordml" xmlns:w16cex="http://schemas.microsoft.com/office/word/2018/wordml/cex" xmlns:w16cid="http://schemas.microsoft.com/office/word/2016/wordml/cid" xmlns:w16="http://schemas.microsoft.com/office/word/2018/wordml" xmlns:w16du="http://schemas.microsoft.com/office/word/2023/wordml/word16du" xmlns:w16sdtdh="http://schemas.microsoft.com/office/word/2020/wordml/sdtdatahash" xmlns:w16sdtfl="http://schemas.microsoft.com/office/word/2024/wordml/sdtformatlock" xmlns:w16se="http://schemas.microsoft.com/office/word/2015/wordml/symex" mc:Ignorable="w14 w15 w16se w16cid w16 w16cex w16sdtdh w16sdtfl w16du">
   <w:docDefaults>
     <w:rPrDefault>
       <w:rPr>

</xml_diff>